<commit_message>
Sprint 12: harden import pipeline, close recovery dedup
Harden import_embedengine.py with manifest schema version gate,
vector dimension cross-check, required chunk field validation
(chunk_id, text, source_path), --strict mode for rebuild preflight,
and enhanced skip_manifest reporting with per-reason breakdown.

Add 15 integration tests covering validation and export loading.
Update .gitignore to filter binaries, screenshots, and benchmark
results. Add SPRINT_SYNC.md for cross-repo coordination. All 6
Sprint 12 slices pass QA.

Co-Authored-By: CoPilot+ <noreply@copilotplus.dev>
</commit_message>
<xml_diff>
--- a/docs/DEDUP_RECOVERY_PLAN_2026-04-06.docx
+++ b/docs/DEDUP_RECOVERY_PLAN_2026-04-06.docx
@@ -351,6 +351,227 @@
     <w:p>
       <w:r>
         <w:t>If that works, the next rebuild should be much smaller, faster, and cheaper.</w:t>
+      </w:r>
+    </w:p>
+    <w:p/>
+    <w:p>
+      <w:pPr>
+        <w:spacing w:after="120"/>
+      </w:pPr>
+    </w:p>
+    <w:p/>
+    <w:p>
+      <w:pPr>
+        <w:pStyle w:val="Heading2"/>
+      </w:pPr>
+      <w:r>
+        <w:t>Verified Evidence From The Existing HybridRAG3 Index</w:t>
+      </w:r>
+    </w:p>
+    <w:p/>
+    <w:p>
+      <w:r>
+        <w:t>This is not just a theory exercise. The existing production-grade HybridRAG3 index provides direct evidence.</w:t>
+      </w:r>
+    </w:p>
+    <w:p/>
+    <w:p>
+      <w:pPr>
+        <w:pStyle w:val="Heading3"/>
+      </w:pPr>
+      <w:r>
+        <w:t>Verified From Local Code And Local Docs</w:t>
+      </w:r>
+    </w:p>
+    <w:p/>
+    <w:p>
+      <w:r>
+        <w:t>In HybridRAG3_Educational, the stored file_hash is documented and implemented as:</w:t>
+      </w:r>
+    </w:p>
+    <w:p/>
+    <w:p>
+      <w:pPr>
+        <w:pStyle w:val="ListBullet"/>
+      </w:pPr>
+      <w:r>
+        <w:t>`filesize:mtime_ns`</w:t>
+      </w:r>
+    </w:p>
+    <w:p/>
+    <w:p>
+      <w:r>
+        <w:t>That means it is a change-detection key, not a true content fingerprint.</w:t>
+      </w:r>
+    </w:p>
+    <w:p/>
+    <w:p>
+      <w:r>
+        <w:t>Verified locally from:</w:t>
+      </w:r>
+    </w:p>
+    <w:p/>
+    <w:p>
+      <w:pPr>
+        <w:pStyle w:val="ListBullet"/>
+      </w:pPr>
+      <w:r>
+        <w:t>`C:\HybridRAG3_Educational\src\core\indexer.py`</w:t>
+      </w:r>
+    </w:p>
+    <w:p>
+      <w:pPr>
+        <w:pStyle w:val="ListBullet"/>
+      </w:pPr>
+      <w:r>
+        <w:t>`C:\HybridRAG3_Educational\docs\02_architecture\TECHNICAL_THEORY_OF_OPERATION_RevC.md`</w:t>
+      </w:r>
+    </w:p>
+    <w:p>
+      <w:pPr>
+        <w:pStyle w:val="ListBullet"/>
+      </w:pPr>
+      <w:r>
+        <w:t>`C:\HybridRAG3_Educational\docs\03_guides\DESKTOP_AUTHORITY_LAPTOP_DELTA_WORKFLOW_2026-03-30.md`</w:t>
+      </w:r>
+    </w:p>
+    <w:p/>
+    <w:p>
+      <w:pPr>
+        <w:pStyle w:val="Heading3"/>
+      </w:pPr>
+      <w:r>
+        <w:t>Verified From The Live SQLite Index</w:t>
+      </w:r>
+    </w:p>
+    <w:p/>
+    <w:p>
+      <w:r>
+        <w:t>Direct counts from C:\HybridRAG3_Educational\data\index\hybridrag.sqlite3:</w:t>
+      </w:r>
+    </w:p>
+    <w:p/>
+    <w:p>
+      <w:pPr>
+        <w:pStyle w:val="ListBullet"/>
+      </w:pPr>
+      <w:r>
+        <w:t>total chunks: `27,607,262`</w:t>
+      </w:r>
+    </w:p>
+    <w:p>
+      <w:pPr>
+        <w:pStyle w:val="ListBullet"/>
+      </w:pPr>
+      <w:r>
+        <w:t>distinct source paths represented in chunks: `187,204`</w:t>
+      </w:r>
+    </w:p>
+    <w:p>
+      <w:pPr>
+        <w:pStyle w:val="ListBullet"/>
+      </w:pPr>
+      <w:r>
+        <w:t>`document_catalog` rows: `187,204`</w:t>
+      </w:r>
+    </w:p>
+    <w:p/>
+    <w:p>
+      <w:r>
+        <w:t>For PDF, DOC, and DOCX rows in document_catalog:</w:t>
+      </w:r>
+    </w:p>
+    <w:p/>
+    <w:p>
+      <w:pPr>
+        <w:pStyle w:val="ListBullet"/>
+      </w:pPr>
+      <w:r>
+        <w:t>total `pdf/doc/docx` rows: `72,940`</w:t>
+      </w:r>
+    </w:p>
+    <w:p>
+      <w:pPr>
+        <w:pStyle w:val="ListBullet"/>
+      </w:pPr>
+      <w:r>
+        <w:t>normalized filename-family count: `39,531`</w:t>
+      </w:r>
+    </w:p>
+    <w:p>
+      <w:pPr>
+        <w:pStyle w:val="ListBullet"/>
+      </w:pPr>
+      <w:r>
+        <w:t>multi-file filename families: `25,565`</w:t>
+      </w:r>
+    </w:p>
+    <w:p>
+      <w:pPr>
+        <w:pStyle w:val="ListBullet"/>
+      </w:pPr>
+      <w:r>
+        <w:t>multi-extension filename families: `2,024`</w:t>
+      </w:r>
+    </w:p>
+    <w:p>
+      <w:pPr>
+        <w:pStyle w:val="ListBullet"/>
+      </w:pPr>
+      <w:r>
+        <w:t>rows inside those multi-extension families: `7,476`</w:t>
+      </w:r>
+    </w:p>
+    <w:p/>
+    <w:p>
+      <w:r>
+        <w:t>This does not prove all 7,476 files are duplicates.</w:t>
+      </w:r>
+    </w:p>
+    <w:p/>
+    <w:p>
+      <w:r>
+        <w:t>It does prove there is a large, real candidate set of cross-format families already visible in the indexed metadata, even without reopening the raw source tree.</w:t>
+      </w:r>
+    </w:p>
+    <w:p/>
+    <w:p>
+      <w:pPr>
+        <w:pStyle w:val="Heading3"/>
+      </w:pPr>
+      <w:r>
+        <w:t>What This Means</w:t>
+      </w:r>
+    </w:p>
+    <w:p/>
+    <w:p>
+      <w:r>
+        <w:t>The existing HybridRAG3 index validates the core concern:</w:t>
+      </w:r>
+    </w:p>
+    <w:p/>
+    <w:p>
+      <w:pPr>
+        <w:pStyle w:val="ListBullet"/>
+      </w:pPr>
+      <w:r>
+        <w:t>the old system did not store a content-level dedup key</w:t>
+      </w:r>
+    </w:p>
+    <w:p>
+      <w:pPr>
+        <w:pStyle w:val="ListBullet"/>
+      </w:pPr>
+      <w:r>
+        <w:t>many `pdf/doc/docx` files already collapse into shared normalized filename families</w:t>
+      </w:r>
+    </w:p>
+    <w:p>
+      <w:pPr>
+        <w:pStyle w:val="ListBullet"/>
+      </w:pPr>
+      <w:r>
+        <w:t>the recovery-stage dedup effort is addressing a real structural gap, not a speculative one</w:t>
       </w:r>
     </w:p>
     <w:p/>

</xml_diff>